<commit_message>
Cite the seventh recording by its full name
The release asset gave the real title, so Part 7, the meeting prep sources and
the master structure map now name the video in full rather than calling it
"Reporting". Part 7 also opens with a note saying it was recorded live, which
separates it from the handover items that are reconstructed.

transcribe.py now writes hours into its timestamps once a recording runs past
sixty minutes, so citations into a two hour video stay readable.

Co-Authored-By: Claude Opus 5 <noreply@anthropic.com>
Claude-Session: https://claude.ai/code/session_01NGLPCmZEnLwWWew5jbH6qG
</commit_message>
<xml_diff>
--- a/manuals/Payroll Processing - Part 7 - Terminations and Out-of-Cycle Pay Runs.docx
+++ b/manuals/Payroll Processing - Part 7 - Terminations and Out-of-Cycle Pay Runs.docx
@@ -125,6 +125,60 @@
         </w:rPr>
         <w:t xml:space="preserve">Parts 1 to 6 cover the fortnightly cycle. This guide covers a pay run that sits outside it: a small, ad hoc pay run created for one or two people, usually because someone has resigned and their final pay cannot wait for the next fortnight.</w:t>
       </w:r>
+    </w:p>
+    <w:tbl>
+      <w:tblPr>
+        <w:tblW w:type="auto" w:w="100"/>
+        <w:tblBorders>
+          <w:top w:val="single" w:color="D0D7E5" w:sz="2"/>
+          <w:left w:val="single" w:color="1F4E79" w:sz="18"/>
+          <w:bottom w:val="single" w:color="D0D7E5" w:sz="2"/>
+          <w:right w:val="single" w:color="D0D7E5" w:sz="2"/>
+          <w:insideH w:val="none"/>
+          <w:insideV w:val="none"/>
+        </w:tblBorders>
+      </w:tblPr>
+      <w:tblGrid>
+        <w:gridCol w:w="9360"/>
+      </w:tblGrid>
+      <w:tr>
+        <w:tc>
+          <w:tcPr>
+            <w:tcW w:type="dxa" w:w="9360"/>
+            <w:shd w:fill="F2F6FB" w:val="clear"/>
+            <w:tcMar>
+              <w:top w:type="dxa" w:w="120"/>
+              <w:left w:type="dxa" w:w="180"/>
+              <w:bottom w:type="dxa" w:w="120"/>
+              <w:right w:type="dxa" w:w="180"/>
+            </w:tcMar>
+          </w:tcPr>
+          <w:p>
+            <w:r>
+              <w:rPr>
+                <w:b/>
+                <w:bCs/>
+                <w:color w:val="1F4E79"/>
+                <w:sz w:val="22"/>
+                <w:szCs w:val="22"/>
+              </w:rPr>
+              <w:t xml:space="preserve">Where this comes from.  </w:t>
+            </w:r>
+            <w:r>
+              <w:rPr>
+                <w:sz w:val="22"/>
+                <w:szCs w:val="22"/>
+              </w:rPr>
+              <w:t xml:space="preserve">Everything in this guide was recorded live in Video 7, Day 5 tasks - Reporting Graphs and HOD Meeting preps. A resignation was processed on camera from start to finish, so unlike the situations in the handover document, this one is not reconstructed.</w:t>
+            </w:r>
+          </w:p>
+        </w:tc>
+      </w:tr>
+    </w:tbl>
+    <w:p>
+      <w:pPr>
+        <w:spacing w:after="200"/>
+      </w:pPr>
     </w:p>
     <w:p>
       <w:pPr>

</xml_diff>